<commit_message>
feat(scanrdi): migrate SOPs to ZenQMS standards MICRO-SOP-12 (Rev 16) and ENG-SOP-4 (Rev 05)
</commit_message>
<xml_diff>
--- a/ScanRDI OOS P1 template 0.docx
+++ b/ScanRDI OOS P1 template 0.docx
@@ -1675,147 +1675,14 @@
             <w:tcW w:w="2503" w:type="dxa"/>
           </w:tcPr>
           <w:p>
-            <w:pPr>
-              <w:outlineLvl w:val="0"/>
-              <w:rPr>
-                <w:rFonts w:ascii="Times New Roman" w:hAnsi="Times New Roman"/>
-                <w:bCs/>
-                <w:sz w:val="22"/>
-                <w:szCs w:val="22"/>
-              </w:rPr>
-            </w:pPr>
-            <w:r>
-              <w:rPr>
-                <w:rFonts w:ascii="Times New Roman" w:hAnsi="Times New Roman"/>
-                <w:bCs/>
-                <w:sz w:val="22"/>
-                <w:szCs w:val="22"/>
-              </w:rPr>
+            <w:r>
               <w:t>SOP / Test Method #:</w:t>
-            </w:r>
-          </w:p>
-          <w:p>
-            <w:pPr>
-              <w:outlineLvl w:val="0"/>
-              <w:rPr>
-                <w:rFonts w:ascii="Times New Roman" w:hAnsi="Times New Roman"/>
-                <w:bCs/>
-                <w:sz w:val="22"/>
-                <w:szCs w:val="22"/>
-              </w:rPr>
-            </w:pPr>
-            <w:r>
-              <w:rPr>
-                <w:rFonts w:ascii="Times New Roman" w:hAnsi="Times New Roman"/>
-                <w:bCs/>
-                <w:sz w:val="22"/>
-                <w:szCs w:val="22"/>
-              </w:rPr>
-              <w:t>2.600.</w:t>
-            </w:r>
-            <w:r>
-              <w:rPr>
-                <w:rFonts w:ascii="Times New Roman" w:hAnsi="Times New Roman"/>
-                <w:bCs/>
-                <w:sz w:val="22"/>
-                <w:szCs w:val="22"/>
-              </w:rPr>
-              <w:t>0</w:t>
-            </w:r>
-            <w:r>
-              <w:rPr>
-                <w:rFonts w:ascii="Times New Roman" w:hAnsi="Times New Roman"/>
-                <w:bCs/>
-                <w:sz w:val="22"/>
-                <w:szCs w:val="22"/>
-              </w:rPr>
-              <w:t>23 (</w:t>
-            </w:r>
-            <w:r>
-              <w:rPr>
-                <w:rFonts w:ascii="Times New Roman" w:hAnsi="Times New Roman"/>
-                <w:bCs/>
-                <w:sz w:val="22"/>
-                <w:szCs w:val="22"/>
-              </w:rPr>
-              <w:t>10</w:t>
-            </w:r>
-            <w:r>
-              <w:rPr>
-                <w:rFonts w:ascii="Times New Roman" w:hAnsi="Times New Roman"/>
-                <w:bCs/>
-                <w:sz w:val="22"/>
-                <w:szCs w:val="22"/>
-              </w:rPr>
-              <w:t>)</w:t>
-            </w:r>
-          </w:p>
-          <w:p>
-            <w:pPr>
-              <w:outlineLvl w:val="0"/>
-              <w:rPr>
-                <w:rFonts w:ascii="Times New Roman" w:hAnsi="Times New Roman"/>
-                <w:bCs/>
-                <w:sz w:val="22"/>
-                <w:szCs w:val="22"/>
-              </w:rPr>
-            </w:pPr>
-            <w:r>
-              <w:rPr>
-                <w:rFonts w:ascii="Times New Roman" w:hAnsi="Times New Roman"/>
-                <w:bCs/>
-                <w:sz w:val="22"/>
-                <w:szCs w:val="22"/>
-              </w:rPr>
-              <w:t>2.700.0</w:t>
-            </w:r>
-            <w:r>
-              <w:rPr>
-                <w:rFonts w:ascii="Times New Roman" w:hAnsi="Times New Roman"/>
-                <w:bCs/>
-                <w:sz w:val="22"/>
-                <w:szCs w:val="22"/>
-              </w:rPr>
-              <w:t>0</w:t>
-            </w:r>
-            <w:r>
-              <w:rPr>
-                <w:rFonts w:ascii="Times New Roman" w:hAnsi="Times New Roman"/>
-                <w:bCs/>
-                <w:sz w:val="22"/>
-                <w:szCs w:val="22"/>
-              </w:rPr>
-              <w:t>4 (0</w:t>
-            </w:r>
-            <w:r>
-              <w:rPr>
-                <w:rFonts w:ascii="Times New Roman" w:hAnsi="Times New Roman"/>
-                <w:bCs/>
-                <w:sz w:val="22"/>
-                <w:szCs w:val="22"/>
-              </w:rPr>
-              <w:t>3</w:t>
-            </w:r>
-            <w:r>
-              <w:rPr>
-                <w:rFonts w:ascii="Times New Roman" w:hAnsi="Times New Roman"/>
-                <w:bCs/>
-                <w:sz w:val="22"/>
-                <w:szCs w:val="22"/>
-              </w:rPr>
-              <w:t>)</w:t>
-            </w:r>
-          </w:p>
-          <w:p>
-            <w:pPr>
-              <w:outlineLvl w:val="0"/>
-              <w:rPr>
-                <w:rFonts w:ascii="Times New Roman" w:hAnsi="Times New Roman"/>
-                <w:bCs/>
-                <w:sz w:val="22"/>
-                <w:szCs w:val="22"/>
-              </w:rPr>
-            </w:pPr>
+              <w:br/>
+              <w:t>MICRO-SOP-12 (16)</w:t>
+              <w:br/>
+              <w:t>ENG-SOP-4 (05)</w:t>
+              <w:br/>
+            </w:r>
           </w:p>
         </w:tc>
         <w:tc>
@@ -1824,63 +1691,12 @@
             <w:gridSpan w:val="5"/>
           </w:tcPr>
           <w:p>
-            <w:pPr>
-              <w:outlineLvl w:val="0"/>
-              <w:rPr>
-                <w:rFonts w:ascii="Times New Roman" w:hAnsi="Times New Roman"/>
-                <w:bCs/>
-                <w:sz w:val="22"/>
-                <w:szCs w:val="22"/>
-              </w:rPr>
-            </w:pPr>
-            <w:r>
-              <w:rPr>
-                <w:rFonts w:ascii="Times New Roman" w:hAnsi="Times New Roman"/>
-                <w:bCs/>
-                <w:sz w:val="22"/>
-                <w:szCs w:val="22"/>
-              </w:rPr>
+            <w:r>
               <w:t xml:space="preserve">Effective Date: </w:t>
-            </w:r>
-          </w:p>
-          <w:p>
-            <w:pPr>
-              <w:outlineLvl w:val="0"/>
-              <w:rPr>
-                <w:rFonts w:ascii="Times New Roman" w:hAnsi="Times New Roman"/>
-                <w:bCs/>
-                <w:sz w:val="22"/>
-                <w:szCs w:val="22"/>
-              </w:rPr>
-            </w:pPr>
-            <w:r>
-              <w:rPr>
-                <w:rFonts w:ascii="Times New Roman" w:hAnsi="Times New Roman"/>
-                <w:bCs/>
-                <w:sz w:val="22"/>
-                <w:szCs w:val="22"/>
-              </w:rPr>
-              <w:t>07Apr25</w:t>
-            </w:r>
-          </w:p>
-          <w:p>
-            <w:pPr>
-              <w:outlineLvl w:val="0"/>
-              <w:rPr>
-                <w:rFonts w:ascii="Times New Roman" w:hAnsi="Times New Roman"/>
-                <w:bCs/>
-                <w:sz w:val="22"/>
-                <w:szCs w:val="22"/>
-              </w:rPr>
-            </w:pPr>
-            <w:r>
-              <w:rPr>
-                <w:rFonts w:ascii="Times New Roman" w:hAnsi="Times New Roman"/>
-                <w:bCs/>
-                <w:sz w:val="22"/>
-                <w:szCs w:val="22"/>
-              </w:rPr>
-              <w:t>02Jan23</w:t>
+              <w:br/>
+              <w:t>24Jul26</w:t>
+              <w:br/>
+              <w:t>24Jul26</w:t>
             </w:r>
           </w:p>
         </w:tc>
@@ -1890,67 +1706,12 @@
             <w:gridSpan w:val="2"/>
           </w:tcPr>
           <w:p>
-            <w:pPr>
-              <w:outlineLvl w:val="0"/>
-              <w:rPr>
-                <w:rFonts w:ascii="Times New Roman" w:hAnsi="Times New Roman"/>
-                <w:bCs/>
-                <w:noProof/>
-                <w:sz w:val="22"/>
-                <w:szCs w:val="22"/>
-              </w:rPr>
-            </w:pPr>
-            <w:r>
-              <w:rPr>
-                <w:rFonts w:ascii="Times New Roman" w:hAnsi="Times New Roman"/>
-                <w:bCs/>
-                <w:noProof/>
-                <w:sz w:val="22"/>
-                <w:szCs w:val="22"/>
-              </w:rPr>
+            <w:r>
               <w:t xml:space="preserve">SOP / Test Method Rev: </w:t>
-            </w:r>
-            <w:r>
-              <w:rPr>
-                <w:rFonts w:ascii="Times New Roman" w:hAnsi="Times New Roman"/>
-                <w:bCs/>
-                <w:noProof/>
-                <w:sz w:val="22"/>
-                <w:szCs w:val="22"/>
-              </w:rPr>
-              <w:t>10</w:t>
-            </w:r>
-          </w:p>
-          <w:p>
-            <w:pPr>
-              <w:outlineLvl w:val="0"/>
-              <w:rPr>
-                <w:rFonts w:ascii="Times New Roman" w:hAnsi="Times New Roman"/>
-                <w:bCs/>
-                <w:noProof/>
-                <w:sz w:val="22"/>
-                <w:szCs w:val="22"/>
-              </w:rPr>
-            </w:pPr>
-            <w:r>
-              <w:rPr>
-                <w:rFonts w:ascii="Times New Roman" w:hAnsi="Times New Roman"/>
-                <w:bCs/>
-                <w:noProof/>
-                <w:sz w:val="22"/>
-                <w:szCs w:val="22"/>
-              </w:rPr>
-              <w:t>Rev: 0</w:t>
-            </w:r>
-            <w:r>
-              <w:rPr>
-                <w:rFonts w:ascii="Times New Roman" w:hAnsi="Times New Roman"/>
-                <w:bCs/>
-                <w:noProof/>
-                <w:sz w:val="22"/>
-                <w:szCs w:val="22"/>
-              </w:rPr>
-              <w:t>3</w:t>
+              <w:br/>
+              <w:t>Rev: 16</w:t>
+              <w:br/>
+              <w:t>Rev: 05</w:t>
             </w:r>
           </w:p>
         </w:tc>
@@ -3281,79 +3042,8 @@
             <w:shd w:val="clear" w:color="auto" w:fill="FFFFFF" w:themeFill="background1"/>
           </w:tcPr>
           <w:p>
-            <w:pPr>
-              <w:jc w:val="center"/>
-              <w:outlineLvl w:val="0"/>
-              <w:rPr>
-                <w:rFonts w:ascii="Times New Roman" w:hAnsi="Times New Roman"/>
-                <w:bCs/>
-                <w:sz w:val="22"/>
-                <w:szCs w:val="22"/>
-              </w:rPr>
-            </w:pPr>
-            <w:r>
-              <w:rPr>
-                <w:rFonts w:ascii="Times New Roman" w:hAnsi="Times New Roman"/>
-                <w:sz w:val="22"/>
-                <w:szCs w:val="22"/>
-              </w:rPr>
-              <w:t xml:space="preserve">Yes, as per SOP </w:t>
-            </w:r>
-            <w:r>
-              <w:rPr>
-                <w:rFonts w:ascii="Times New Roman" w:hAnsi="Times New Roman"/>
-                <w:sz w:val="22"/>
-                <w:szCs w:val="22"/>
-              </w:rPr>
-              <w:t>2.600.</w:t>
-            </w:r>
-            <w:r>
-              <w:rPr>
-                <w:rFonts w:ascii="Times New Roman" w:hAnsi="Times New Roman"/>
-                <w:sz w:val="22"/>
-                <w:szCs w:val="22"/>
-              </w:rPr>
-              <w:t>0</w:t>
-            </w:r>
-            <w:r>
-              <w:rPr>
-                <w:rFonts w:ascii="Times New Roman" w:hAnsi="Times New Roman"/>
-                <w:sz w:val="22"/>
-                <w:szCs w:val="22"/>
-              </w:rPr>
-              <w:t>23</w:t>
-            </w:r>
-            <w:r>
-              <w:rPr>
-                <w:rFonts w:ascii="Times New Roman" w:hAnsi="Times New Roman"/>
-                <w:sz w:val="22"/>
-                <w:szCs w:val="22"/>
-              </w:rPr>
-              <w:t xml:space="preserve">, </w:t>
-            </w:r>
-            <w:r>
-              <w:rPr>
-                <w:rFonts w:ascii="Times New Roman" w:hAnsi="Times New Roman"/>
-                <w:sz w:val="22"/>
-                <w:szCs w:val="22"/>
-              </w:rPr>
-              <w:t>2.700.0</w:t>
-            </w:r>
-            <w:r>
-              <w:rPr>
-                <w:rFonts w:ascii="Times New Roman" w:hAnsi="Times New Roman"/>
-                <w:sz w:val="22"/>
-                <w:szCs w:val="22"/>
-              </w:rPr>
-              <w:t>0</w:t>
-            </w:r>
-            <w:r>
-              <w:rPr>
-                <w:rFonts w:ascii="Times New Roman" w:hAnsi="Times New Roman"/>
-                <w:sz w:val="22"/>
-                <w:szCs w:val="22"/>
-              </w:rPr>
-              <w:t>4</w:t>
+            <w:r>
+              <w:t>Yes, as per MICRO-SOP-12, ENG-SOP-4</w:t>
             </w:r>
           </w:p>
         </w:tc>
@@ -3593,23 +3283,8 @@
             <w:shd w:val="clear" w:color="auto" w:fill="FFFFFF" w:themeFill="background1"/>
           </w:tcPr>
           <w:p>
-            <w:pPr>
-              <w:jc w:val="center"/>
-              <w:outlineLvl w:val="0"/>
-              <w:rPr>
-                <w:rFonts w:ascii="Times New Roman" w:hAnsi="Times New Roman"/>
-                <w:b/>
-                <w:sz w:val="22"/>
-                <w:szCs w:val="22"/>
-              </w:rPr>
-            </w:pPr>
-            <w:r>
-              <w:rPr>
-                <w:rFonts w:ascii="Times New Roman" w:hAnsi="Times New Roman"/>
-                <w:sz w:val="22"/>
-                <w:szCs w:val="22"/>
-              </w:rPr>
-              <w:t>Yes, as per SOP 2.600.023, 2.700.004</w:t>
+            <w:r>
+              <w:t>Yes, as per MICRO-SOP-12, ENG-SOP-4</w:t>
             </w:r>
           </w:p>
         </w:tc>
@@ -10457,1029 +10132,49 @@
             <w:shd w:val="clear" w:color="auto" w:fill="FFFFFF" w:themeFill="background1"/>
           </w:tcPr>
           <w:p>
-            <w:pPr>
-              <w:outlineLvl w:val="0"/>
-              <w:rPr>
-                <w:rFonts w:ascii="Times New Roman" w:hAnsi="Times New Roman"/>
-                <w:bCs/>
-                <w:sz w:val="22"/>
-                <w:szCs w:val="22"/>
-              </w:rPr>
-            </w:pPr>
-            <w:r>
-              <w:rPr>
-                <w:rFonts w:ascii="Times New Roman" w:hAnsi="Times New Roman"/>
-                <w:bCs/>
-                <w:sz w:val="22"/>
-                <w:szCs w:val="22"/>
-              </w:rPr>
+            <w:r>
               <w:t xml:space="preserve">Phase I Summary: </w:t>
-            </w:r>
-          </w:p>
-          <w:p>
-            <w:pPr>
-              <w:outlineLvl w:val="0"/>
-              <w:rPr>
-                <w:rFonts w:ascii="Times New Roman" w:hAnsi="Times New Roman"/>
-                <w:bCs/>
-                <w:sz w:val="22"/>
-                <w:szCs w:val="22"/>
-              </w:rPr>
-            </w:pPr>
-          </w:p>
-          <w:p>
-            <w:pPr>
-              <w:outlineLvl w:val="0"/>
-              <w:rPr>
-                <w:rFonts w:ascii="Times New Roman" w:hAnsi="Times New Roman"/>
-                <w:bCs/>
-                <w:sz w:val="22"/>
-                <w:szCs w:val="22"/>
-              </w:rPr>
-            </w:pPr>
-            <w:r>
-              <w:rPr>
-                <w:rFonts w:ascii="Times New Roman" w:hAnsi="Times New Roman"/>
-                <w:bCs/>
-                <w:sz w:val="22"/>
-                <w:szCs w:val="22"/>
-              </w:rPr>
-              <w:t xml:space="preserve">All analysts involved in the prepping, processing, and reading of the samples </w:t>
-            </w:r>
-            <w:r>
-              <w:rPr>
-                <w:rFonts w:ascii="Times New Roman" w:hAnsi="Times New Roman"/>
-                <w:bCs/>
-                <w:sz w:val="22"/>
-                <w:szCs w:val="22"/>
-              </w:rPr>
-              <w:t>–</w:t>
-            </w:r>
-            <w:r>
-              <w:rPr>
-                <w:rFonts w:ascii="Times New Roman" w:hAnsi="Times New Roman"/>
-                <w:bCs/>
-                <w:sz w:val="22"/>
-                <w:szCs w:val="22"/>
-              </w:rPr>
-              <w:t xml:space="preserve"> </w:t>
-            </w:r>
-            <w:r>
-              <w:rPr>
-                <w:rFonts w:ascii="Times New Roman" w:hAnsi="Times New Roman"/>
-                <w:bCs/>
-                <w:sz w:val="22"/>
-                <w:szCs w:val="22"/>
-              </w:rPr>
-              <w:t>{{ prepper_name }}, {{ analyst_name }}</w:t>
-            </w:r>
-            <w:r>
-              <w:rPr>
-                <w:rFonts w:ascii="Times New Roman" w:hAnsi="Times New Roman"/>
-                <w:bCs/>
-                <w:sz w:val="22"/>
-                <w:szCs w:val="22"/>
-              </w:rPr>
-              <w:t xml:space="preserve"> </w:t>
-            </w:r>
-            <w:r>
-              <w:rPr>
-                <w:rFonts w:ascii="Times New Roman" w:hAnsi="Times New Roman"/>
-                <w:bCs/>
-                <w:sz w:val="22"/>
-                <w:szCs w:val="22"/>
-              </w:rPr>
-              <w:t>and {{ reader_name }}</w:t>
-            </w:r>
-            <w:r>
-              <w:rPr>
-                <w:rFonts w:ascii="Times New Roman" w:hAnsi="Times New Roman"/>
-                <w:bCs/>
-                <w:sz w:val="22"/>
-                <w:szCs w:val="22"/>
-              </w:rPr>
-              <w:t xml:space="preserve"> </w:t>
-            </w:r>
-            <w:r>
-              <w:rPr>
-                <w:rFonts w:ascii="Times New Roman" w:hAnsi="Times New Roman"/>
-                <w:bCs/>
-                <w:sz w:val="22"/>
-                <w:szCs w:val="22"/>
-              </w:rPr>
-              <w:t xml:space="preserve">– </w:t>
-            </w:r>
-            <w:r>
-              <w:rPr>
-                <w:rFonts w:ascii="Times New Roman" w:hAnsi="Times New Roman"/>
-                <w:bCs/>
-                <w:sz w:val="22"/>
-                <w:szCs w:val="22"/>
-              </w:rPr>
-              <w:t>were</w:t>
-            </w:r>
-            <w:r>
-              <w:rPr>
-                <w:rFonts w:ascii="Times New Roman" w:hAnsi="Times New Roman"/>
-                <w:bCs/>
-                <w:sz w:val="22"/>
-                <w:szCs w:val="22"/>
-              </w:rPr>
-              <w:t xml:space="preserve"> interviewed and their answers are recorded throughout this document. </w:t>
-            </w:r>
-          </w:p>
-          <w:p>
-            <w:pPr>
-              <w:outlineLvl w:val="0"/>
-              <w:rPr>
-                <w:rFonts w:ascii="Times New Roman" w:hAnsi="Times New Roman"/>
-                <w:bCs/>
-                <w:sz w:val="22"/>
-                <w:szCs w:val="22"/>
-              </w:rPr>
-            </w:pPr>
-          </w:p>
-          <w:p>
-            <w:pPr>
-              <w:outlineLvl w:val="0"/>
-              <w:rPr>
-                <w:rFonts w:ascii="Times New Roman" w:hAnsi="Times New Roman"/>
-                <w:bCs/>
-                <w:sz w:val="22"/>
-                <w:szCs w:val="22"/>
-              </w:rPr>
-            </w:pPr>
-            <w:r>
-              <w:rPr>
-                <w:rFonts w:ascii="Times New Roman" w:hAnsi="Times New Roman"/>
-                <w:bCs/>
-                <w:sz w:val="22"/>
-                <w:szCs w:val="22"/>
-              </w:rPr>
-              <w:t xml:space="preserve">The sample was stored upon arrival according to the Client’s instructions. Analysts </w:t>
-            </w:r>
-            <w:r>
-              <w:rPr>
-                <w:rFonts w:ascii="Times New Roman" w:hAnsi="Times New Roman"/>
-                <w:bCs/>
-                <w:sz w:val="22"/>
-                <w:szCs w:val="22"/>
-              </w:rPr>
-              <w:t>{{ prepper_name }}</w:t>
-            </w:r>
-            <w:r>
-              <w:rPr>
-                <w:rFonts w:ascii="Times New Roman" w:hAnsi="Times New Roman"/>
-                <w:bCs/>
-                <w:sz w:val="22"/>
-                <w:szCs w:val="22"/>
-              </w:rPr>
-              <w:t xml:space="preserve"> and </w:t>
-            </w:r>
-            <w:r>
-              <w:rPr>
-                <w:rFonts w:ascii="Times New Roman" w:hAnsi="Times New Roman"/>
-                <w:bCs/>
-                <w:sz w:val="22"/>
-                <w:szCs w:val="22"/>
-              </w:rPr>
-              <w:t>{{ analyst_name }}</w:t>
-            </w:r>
-            <w:r>
-              <w:rPr>
-                <w:rFonts w:ascii="Times New Roman" w:hAnsi="Times New Roman"/>
-                <w:bCs/>
-                <w:sz w:val="22"/>
-                <w:szCs w:val="22"/>
-              </w:rPr>
-              <w:t xml:space="preserve"> confirmed the integrity of the samples throughout both the preparation and processing stages. No leaks or turbidity were observed at any point, verifying </w:t>
-            </w:r>
-            <w:r>
-              <w:rPr>
-                <w:rFonts w:ascii="Times New Roman" w:hAnsi="Times New Roman"/>
-                <w:bCs/>
-                <w:sz w:val="22"/>
-                <w:szCs w:val="22"/>
-              </w:rPr>
-              <w:t>the integrity of the sample</w:t>
-            </w:r>
-            <w:r>
-              <w:rPr>
-                <w:rFonts w:ascii="Times New Roman" w:hAnsi="Times New Roman"/>
-                <w:bCs/>
-                <w:sz w:val="22"/>
-                <w:szCs w:val="22"/>
-              </w:rPr>
-              <w:t>.</w:t>
-            </w:r>
-          </w:p>
-          <w:p>
-            <w:pPr>
-              <w:outlineLvl w:val="0"/>
-              <w:rPr>
-                <w:rFonts w:ascii="Times New Roman" w:hAnsi="Times New Roman"/>
-                <w:bCs/>
-                <w:sz w:val="22"/>
-                <w:szCs w:val="22"/>
-              </w:rPr>
-            </w:pPr>
-          </w:p>
-          <w:p>
-            <w:pPr>
-              <w:outlineLvl w:val="0"/>
-              <w:rPr>
-                <w:rFonts w:ascii="Times New Roman" w:hAnsi="Times New Roman"/>
-                <w:bCs/>
-                <w:sz w:val="22"/>
-                <w:szCs w:val="22"/>
-              </w:rPr>
-            </w:pPr>
-            <w:r>
-              <w:rPr>
-                <w:rFonts w:ascii="Times New Roman" w:hAnsi="Times New Roman"/>
-                <w:bCs/>
-                <w:sz w:val="22"/>
-                <w:szCs w:val="22"/>
-              </w:rPr>
-              <w:t xml:space="preserve">All reagents and supplies mentioned in the material section above were stored according to the suppliers’ recommendations, and their integrity </w:t>
-            </w:r>
-            <w:r>
-              <w:rPr>
-                <w:rFonts w:ascii="Times New Roman" w:hAnsi="Times New Roman"/>
-                <w:bCs/>
-                <w:sz w:val="22"/>
-                <w:szCs w:val="22"/>
-              </w:rPr>
-              <w:t>was</w:t>
-            </w:r>
-            <w:r>
-              <w:rPr>
-                <w:rFonts w:ascii="Times New Roman" w:hAnsi="Times New Roman"/>
-                <w:bCs/>
-                <w:sz w:val="22"/>
-                <w:szCs w:val="22"/>
-              </w:rPr>
-              <w:t xml:space="preserve"> visually verified before utilization. Moreover, each reagent and supply had valid expiration dates. </w:t>
-            </w:r>
-          </w:p>
-          <w:p>
-            <w:pPr>
-              <w:outlineLvl w:val="0"/>
-              <w:rPr>
-                <w:rFonts w:ascii="Times New Roman" w:hAnsi="Times New Roman"/>
-                <w:bCs/>
-                <w:sz w:val="22"/>
-                <w:szCs w:val="22"/>
-              </w:rPr>
-            </w:pPr>
-          </w:p>
-          <w:p>
-            <w:pPr>
-              <w:outlineLvl w:val="0"/>
-              <w:rPr>
-                <w:rFonts w:ascii="Times New Roman" w:eastAsiaTheme="minorEastAsia" w:hAnsi="Times New Roman"/>
-                <w:bCs/>
-                <w:sz w:val="22"/>
-                <w:szCs w:val="22"/>
-                <w:lang w:eastAsia="zh-CN"/>
-              </w:rPr>
-            </w:pPr>
-            <w:r>
-              <w:rPr>
-                <w:rFonts w:ascii="Times New Roman" w:hAnsi="Times New Roman"/>
-                <w:bCs/>
-                <w:sz w:val="22"/>
-                <w:szCs w:val="22"/>
-              </w:rPr>
-              <w:t xml:space="preserve">During the preparation phase, </w:t>
-            </w:r>
-            <w:r>
-              <w:rPr>
-                <w:rFonts w:ascii="Times New Roman" w:hAnsi="Times New Roman"/>
-                <w:bCs/>
-                <w:sz w:val="22"/>
-                <w:szCs w:val="22"/>
-              </w:rPr>
-              <w:t>{{ prepper_name }}</w:t>
-            </w:r>
-            <w:r>
-              <w:rPr>
-                <w:rFonts w:ascii="Times New Roman" w:hAnsi="Times New Roman"/>
-                <w:bCs/>
-                <w:sz w:val="22"/>
-                <w:szCs w:val="22"/>
-              </w:rPr>
-              <w:t xml:space="preserve"> </w:t>
-            </w:r>
-            <w:r>
-              <w:rPr>
-                <w:rFonts w:ascii="Times New Roman" w:hAnsi="Times New Roman"/>
-                <w:bCs/>
-                <w:sz w:val="22"/>
-                <w:szCs w:val="22"/>
-              </w:rPr>
-              <w:t xml:space="preserve">disinfected the samples using acidified bleach and placed them into a pre-disinfected storage bin. On </w:t>
-            </w:r>
-            <w:r>
-              <w:rPr>
-                <w:rFonts w:ascii="Times New Roman" w:hAnsi="Times New Roman"/>
-                <w:bCs/>
-                <w:sz w:val="22"/>
-                <w:szCs w:val="22"/>
-              </w:rPr>
-              <w:t>{{ test_date }}</w:t>
-            </w:r>
-            <w:r>
-              <w:rPr>
-                <w:rFonts w:ascii="Times New Roman" w:hAnsi="Times New Roman"/>
-                <w:bCs/>
-                <w:sz w:val="22"/>
-                <w:szCs w:val="22"/>
-              </w:rPr>
-              <w:t xml:space="preserve">, prior to sample processing, </w:t>
-            </w:r>
-            <w:r>
-              <w:rPr>
-                <w:rFonts w:ascii="Times New Roman" w:hAnsi="Times New Roman"/>
-                <w:bCs/>
-                <w:sz w:val="22"/>
-                <w:szCs w:val="22"/>
-              </w:rPr>
-              <w:t>{{ analyst_name }}</w:t>
-            </w:r>
-            <w:r>
-              <w:rPr>
-                <w:rFonts w:ascii="Times New Roman" w:hAnsi="Times New Roman"/>
-                <w:bCs/>
-                <w:sz w:val="22"/>
-                <w:szCs w:val="22"/>
-              </w:rPr>
-              <w:t xml:space="preserve"> performed a second disinfection with acidified bleach, allowing a minimum contact time of 10 minutes before transferring the samples into </w:t>
-            </w:r>
-            <w:r>
-              <w:rPr>
-                <w:rFonts w:ascii="Times New Roman" w:hAnsi="Times New Roman"/>
-                <w:bCs/>
-                <w:sz w:val="22"/>
-                <w:szCs w:val="22"/>
-              </w:rPr>
-              <w:lastRenderedPageBreak/>
-              <w:t>the cleanroom suites. A final disinfection step was completed immediately before the samples were introduced into the ISO 5 Biological Safety Cabinet (BSC), E00</w:t>
-            </w:r>
-            <w:r>
-              <w:rPr>
-                <w:rFonts w:ascii="Times New Roman" w:hAnsi="Times New Roman"/>
-                <w:bCs/>
-                <w:sz w:val="22"/>
-                <w:szCs w:val="22"/>
-              </w:rPr>
-              <w:t>{{ bsc_id }}</w:t>
-            </w:r>
-            <w:r>
-              <w:rPr>
-                <w:rFonts w:ascii="Times New Roman" w:hAnsi="Times New Roman"/>
-                <w:bCs/>
-                <w:sz w:val="22"/>
-                <w:szCs w:val="22"/>
-              </w:rPr>
-              <w:t xml:space="preserve">, located within the </w:t>
-            </w:r>
-            <w:r>
-              <w:rPr>
-                <w:rFonts w:ascii="Times New Roman" w:hAnsi="Times New Roman"/>
-                <w:bCs/>
-                <w:sz w:val="22"/>
-                <w:szCs w:val="22"/>
-              </w:rPr>
-              <w:t>{{ bsc_loc</w:t>
-            </w:r>
-            <w:r>
-              <w:rPr>
-                <w:rFonts w:ascii="Times New Roman" w:hAnsi="Times New Roman"/>
-                <w:bCs/>
-                <w:sz w:val="22"/>
-                <w:szCs w:val="22"/>
-              </w:rPr>
-              <w:t>ation</w:t>
-            </w:r>
-            <w:r>
-              <w:rPr>
-                <w:rFonts w:ascii="Times New Roman" w:hAnsi="Times New Roman"/>
-                <w:bCs/>
-                <w:sz w:val="22"/>
-                <w:szCs w:val="22"/>
-              </w:rPr>
-              <w:t xml:space="preserve"> }}</w:t>
-            </w:r>
-            <w:r>
-              <w:rPr>
-                <w:rFonts w:ascii="Times New Roman" w:hAnsi="Times New Roman"/>
-                <w:bCs/>
-                <w:sz w:val="22"/>
-                <w:szCs w:val="22"/>
-              </w:rPr>
-              <w:t xml:space="preserve">, </w:t>
-            </w:r>
-            <w:r>
-              <w:rPr>
-                <w:rFonts w:ascii="Times New Roman" w:hAnsi="Times New Roman"/>
-                <w:bCs/>
-                <w:sz w:val="22"/>
-                <w:szCs w:val="22"/>
-              </w:rPr>
-              <w:t xml:space="preserve">(Suite {{ cr_suit }}{{ suit }}), </w:t>
-            </w:r>
-            <w:r>
-              <w:rPr>
-                <w:rFonts w:ascii="Times New Roman" w:hAnsi="Times New Roman"/>
-                <w:bCs/>
-                <w:sz w:val="22"/>
-                <w:szCs w:val="22"/>
-              </w:rPr>
-              <w:t>All activities were performed in accordance with SOP 2.600.023, Rapid Scan RDI® Test Using FIFU Method.</w:t>
-            </w:r>
-          </w:p>
-          <w:p>
-            <w:pPr>
-              <w:outlineLvl w:val="0"/>
-              <w:rPr>
-                <w:rFonts w:ascii="Times New Roman" w:eastAsiaTheme="minorEastAsia" w:hAnsi="Times New Roman"/>
-                <w:bCs/>
-                <w:sz w:val="22"/>
-                <w:szCs w:val="22"/>
-                <w:lang w:eastAsia="zh-CN"/>
-              </w:rPr>
-            </w:pPr>
-          </w:p>
-          <w:p>
-            <w:pPr>
-              <w:outlineLvl w:val="0"/>
-              <w:rPr>
-                <w:rFonts w:ascii="Times New Roman" w:eastAsiaTheme="minorEastAsia" w:hAnsi="Times New Roman"/>
-                <w:bCs/>
-                <w:sz w:val="22"/>
-                <w:szCs w:val="22"/>
-                <w:lang w:eastAsia="zh-CN"/>
-              </w:rPr>
-            </w:pPr>
-            <w:r>
-              <w:rPr>
-                <w:rFonts w:ascii="Times New Roman" w:hAnsi="Times New Roman"/>
-                <w:bCs/>
-                <w:sz w:val="22"/>
-                <w:szCs w:val="22"/>
-              </w:rPr>
+              <w:br/>
+              <w:br/>
+              <w:t xml:space="preserve">All analysts involved in the prepping, processing, and reading of the samples – {{ prepper_name }}, {{ analyst_name }} and {{ reader_name }} – were interviewed and their answers are recorded throughout this document. </w:t>
+              <w:br/>
+              <w:br/>
+              <w:t>The sample was stored upon arrival according to the Client’s instructions. Analysts {{ prepper_name }} and {{ analyst_name }} confirmed the integrity of the samples throughout both the preparation and processing stages. No leaks or turbidity were observed at any point, verifying the integrity of the sample.</w:t>
+              <w:br/>
+              <w:br/>
+              <w:t xml:space="preserve">All reagents and supplies mentioned in the material section above were stored according to the suppliers’ recommendations, and their integrity was visually verified before utilization. Moreover, each reagent and supply had valid expiration dates. </w:t>
+              <w:br/>
+              <w:br/>
+              <w:t>During the preparation phase, {{ prepper_name }} disinfected the samples using acidified bleach and placed them into a pre-disinfected storage bin. On {{ test_date }}, prior to sample processing, {{ analyst_name }} performed a second disinfection with acidified bleach, allowing a minimum contact time of 10 minutes before transferring the samples into the cleanroom suites. A final disinfection step was completed immediately before the samples were introduced into the ISO 5 Biological Safety Cabinet (BSC), E00{{ bsc_id }}, located within the {{ bsc_location }}, (Suite {{ cr_suit }}{{ suit }}), All activities were performed in accordance with MICRO-SOP-12, Rapid Scan RDI® Test using FIFU Method.</w:t>
+              <w:br/>
+              <w:br/>
               <w:t>{{ equipment_summary }}</w:t>
-            </w:r>
-          </w:p>
-          <w:p>
-            <w:pPr>
-              <w:outlineLvl w:val="0"/>
-              <w:rPr>
-                <w:rFonts w:ascii="Times New Roman" w:eastAsiaTheme="minorEastAsia" w:hAnsi="Times New Roman"/>
-                <w:bCs/>
-                <w:sz w:val="22"/>
-                <w:szCs w:val="22"/>
-                <w:lang w:eastAsia="zh-CN"/>
-              </w:rPr>
-            </w:pPr>
-          </w:p>
-          <w:p>
-            <w:pPr>
-              <w:outlineLvl w:val="0"/>
-              <w:rPr>
-                <w:rFonts w:ascii="Times New Roman" w:hAnsi="Times New Roman"/>
-                <w:bCs/>
-                <w:sz w:val="22"/>
-                <w:szCs w:val="22"/>
-              </w:rPr>
-            </w:pPr>
-            <w:r>
-              <w:rPr>
-                <w:rFonts w:ascii="Times New Roman" w:hAnsi="Times New Roman"/>
-                <w:bCs/>
-                <w:sz w:val="22"/>
-                <w:szCs w:val="22"/>
-              </w:rPr>
-              <w:t xml:space="preserve">The analyst, </w:t>
-            </w:r>
-            <w:r>
-              <w:rPr>
-                <w:rFonts w:ascii="Times New Roman" w:hAnsi="Times New Roman"/>
-                <w:bCs/>
-                <w:sz w:val="22"/>
-                <w:szCs w:val="22"/>
-              </w:rPr>
-              <w:t>{{ reader_name }}</w:t>
-            </w:r>
-            <w:r>
-              <w:rPr>
-                <w:rFonts w:ascii="Times New Roman" w:hAnsi="Times New Roman" w:hint="eastAsia"/>
-                <w:bCs/>
-                <w:sz w:val="22"/>
-                <w:szCs w:val="22"/>
-              </w:rPr>
-              <w:t xml:space="preserve">, </w:t>
-            </w:r>
-            <w:r>
-              <w:rPr>
-                <w:rFonts w:ascii="Times New Roman" w:hAnsi="Times New Roman"/>
-                <w:bCs/>
-                <w:sz w:val="22"/>
-                <w:szCs w:val="22"/>
-              </w:rPr>
-              <w:t>confirmed that the equipment was set up as per</w:t>
-            </w:r>
-            <w:r>
-              <w:rPr>
-                <w:rFonts w:ascii="Times New Roman" w:hAnsi="Times New Roman"/>
-                <w:bCs/>
-                <w:sz w:val="22"/>
-                <w:szCs w:val="22"/>
-              </w:rPr>
-              <w:t xml:space="preserve"> SOP 2.700.004 (Scan RDI® System – Operations (Standard C3 Quality Check and Microscope Setup and Maintenance), and the negative control and the positive control for the analyst</w:t>
-            </w:r>
-            <w:r>
-              <w:rPr>
-                <w:rFonts w:ascii="Times New Roman" w:hAnsi="Times New Roman" w:hint="eastAsia"/>
-                <w:bCs/>
-                <w:sz w:val="22"/>
-                <w:szCs w:val="22"/>
-              </w:rPr>
-              <w:t>,</w:t>
-            </w:r>
-            <w:r>
-              <w:rPr>
-                <w:rFonts w:ascii="Times New Roman" w:hAnsi="Times New Roman"/>
-                <w:bCs/>
-                <w:sz w:val="22"/>
-                <w:szCs w:val="22"/>
-              </w:rPr>
-              <w:t xml:space="preserve"> </w:t>
-            </w:r>
-            <w:r>
-              <w:rPr>
-                <w:rFonts w:ascii="Times New Roman" w:hAnsi="Times New Roman"/>
-                <w:bCs/>
-                <w:sz w:val="22"/>
-                <w:szCs w:val="22"/>
-              </w:rPr>
-              <w:t>{{ reader_name }}</w:t>
-            </w:r>
-            <w:r>
-              <w:rPr>
-                <w:rFonts w:ascii="Times New Roman" w:hAnsi="Times New Roman" w:hint="eastAsia"/>
-                <w:bCs/>
-                <w:sz w:val="22"/>
-                <w:szCs w:val="22"/>
-              </w:rPr>
-              <w:t>,</w:t>
-            </w:r>
-            <w:r>
-              <w:rPr>
-                <w:rFonts w:ascii="Times New Roman" w:hAnsi="Times New Roman"/>
-                <w:bCs/>
-                <w:sz w:val="22"/>
-                <w:szCs w:val="22"/>
-              </w:rPr>
-              <w:t xml:space="preserve"> yielded expected results</w:t>
-            </w:r>
-            <w:r>
-              <w:rPr>
-                <w:rFonts w:ascii="Times New Roman" w:hAnsi="Times New Roman"/>
-                <w:bCs/>
-                <w:sz w:val="22"/>
-                <w:szCs w:val="22"/>
-              </w:rPr>
-              <w:t>.</w:t>
-            </w:r>
-          </w:p>
-          <w:p>
-            <w:pPr>
-              <w:outlineLvl w:val="0"/>
-              <w:rPr>
-                <w:rFonts w:ascii="Times New Roman" w:hAnsi="Times New Roman"/>
-                <w:bCs/>
-                <w:sz w:val="22"/>
-                <w:szCs w:val="22"/>
-              </w:rPr>
-            </w:pPr>
-          </w:p>
-          <w:p>
-            <w:pPr>
-              <w:outlineLvl w:val="0"/>
-              <w:rPr>
-                <w:rFonts w:ascii="Times New Roman" w:eastAsiaTheme="minorEastAsia" w:hAnsi="Times New Roman"/>
-                <w:bCs/>
-                <w:sz w:val="22"/>
-                <w:szCs w:val="22"/>
-                <w:lang w:eastAsia="zh-CN"/>
-              </w:rPr>
-            </w:pPr>
-            <w:r>
-              <w:rPr>
-                <w:rFonts w:ascii="Times New Roman" w:hAnsi="Times New Roman"/>
-                <w:bCs/>
-                <w:sz w:val="22"/>
-                <w:szCs w:val="22"/>
-              </w:rPr>
-              <w:t xml:space="preserve">On </w:t>
-            </w:r>
-            <w:r>
-              <w:rPr>
-                <w:rFonts w:ascii="Times New Roman" w:hAnsi="Times New Roman"/>
-                <w:bCs/>
-                <w:sz w:val="22"/>
-                <w:szCs w:val="22"/>
-              </w:rPr>
-              <w:t>{{ test_date }}</w:t>
-            </w:r>
-            <w:r>
-              <w:rPr>
-                <w:rFonts w:ascii="Times New Roman" w:hAnsi="Times New Roman"/>
-                <w:bCs/>
-                <w:sz w:val="22"/>
-                <w:szCs w:val="22"/>
-              </w:rPr>
-              <w:t xml:space="preserve">, a rapid sterility test was conducted on the sample using the ScanRDI method. The sample was initially prepared by Analyst </w:t>
-            </w:r>
-            <w:r>
-              <w:rPr>
-                <w:rFonts w:ascii="Times New Roman" w:hAnsi="Times New Roman"/>
-                <w:bCs/>
-                <w:sz w:val="22"/>
-                <w:szCs w:val="22"/>
-              </w:rPr>
-              <w:t>{{ prepper_name }}</w:t>
-            </w:r>
-            <w:r>
-              <w:rPr>
-                <w:rFonts w:ascii="Times New Roman" w:hAnsi="Times New Roman"/>
-                <w:bCs/>
-                <w:sz w:val="22"/>
-                <w:szCs w:val="22"/>
-              </w:rPr>
-              <w:t xml:space="preserve">, processed by </w:t>
-            </w:r>
-            <w:r>
-              <w:rPr>
-                <w:rFonts w:ascii="Times New Roman" w:hAnsi="Times New Roman"/>
-                <w:bCs/>
-                <w:sz w:val="22"/>
-                <w:szCs w:val="22"/>
-              </w:rPr>
-              <w:t>{{ analyst_name }}</w:t>
-            </w:r>
-            <w:r>
-              <w:rPr>
-                <w:rFonts w:ascii="Times New Roman" w:hAnsi="Times New Roman"/>
-                <w:bCs/>
-                <w:sz w:val="22"/>
-                <w:szCs w:val="22"/>
-              </w:rPr>
-              <w:t xml:space="preserve">, and subsequently read by </w:t>
-            </w:r>
-            <w:r>
-              <w:rPr>
-                <w:rFonts w:ascii="Times New Roman" w:hAnsi="Times New Roman"/>
-                <w:bCs/>
-                <w:sz w:val="22"/>
-                <w:szCs w:val="22"/>
-              </w:rPr>
-              <w:t>{{ analyst_name }}</w:t>
-            </w:r>
-            <w:r>
-              <w:rPr>
-                <w:rFonts w:ascii="Times New Roman" w:hAnsi="Times New Roman"/>
-                <w:bCs/>
-                <w:sz w:val="22"/>
-                <w:szCs w:val="22"/>
-              </w:rPr>
-              <w:t>. The test revealed</w:t>
-            </w:r>
-            <w:r>
-              <w:rPr>
-                <w:rFonts w:ascii="Times New Roman" w:eastAsiaTheme="minorEastAsia" w:hAnsi="Times New Roman" w:hint="eastAsia"/>
-                <w:bCs/>
-                <w:sz w:val="22"/>
-                <w:szCs w:val="22"/>
-                <w:lang w:eastAsia="zh-CN"/>
-              </w:rPr>
-              <w:t xml:space="preserve"> </w:t>
-            </w:r>
-            <w:r>
-              <w:rPr>
-                <w:rFonts w:ascii="Times New Roman" w:eastAsiaTheme="minorEastAsia" w:hAnsi="Times New Roman"/>
-                <w:bCs/>
-                <w:sz w:val="22"/>
-                <w:szCs w:val="22"/>
-                <w:lang w:eastAsia="zh-CN"/>
-              </w:rPr>
-              <w:t>{{ confirm_number }}</w:t>
-            </w:r>
-            <w:r>
-              <w:rPr>
-                <w:rFonts w:ascii="Times New Roman" w:eastAsiaTheme="minorEastAsia" w:hAnsi="Times New Roman" w:hint="eastAsia"/>
-                <w:bCs/>
-                <w:sz w:val="22"/>
-                <w:szCs w:val="22"/>
-                <w:lang w:eastAsia="zh-CN"/>
-              </w:rPr>
-              <w:t xml:space="preserve"> </w:t>
-            </w:r>
-            <w:r>
-              <w:rPr>
-                <w:rFonts w:ascii="Times New Roman" w:hAnsi="Times New Roman"/>
-                <w:bCs/>
-                <w:sz w:val="22"/>
-                <w:szCs w:val="22"/>
-              </w:rPr>
-              <w:t>{{ organism_morphology }}</w:t>
-            </w:r>
-            <w:r>
-              <w:rPr>
-                <w:rFonts w:ascii="Times New Roman" w:hAnsi="Times New Roman"/>
-                <w:bCs/>
-                <w:sz w:val="22"/>
-                <w:szCs w:val="22"/>
-              </w:rPr>
-              <w:t>-shaped viable microorganisms</w:t>
-            </w:r>
-            <w:r>
-              <w:rPr>
-                <w:rFonts w:ascii="Times New Roman" w:eastAsiaTheme="minorEastAsia" w:hAnsi="Times New Roman" w:hint="eastAsia"/>
-                <w:bCs/>
-                <w:sz w:val="22"/>
-                <w:szCs w:val="22"/>
-                <w:lang w:eastAsia="zh-CN"/>
-              </w:rPr>
-              <w:t>,</w:t>
-            </w:r>
-            <w:r>
-              <w:rPr>
-                <w:rFonts w:ascii="Times New Roman" w:eastAsiaTheme="minorEastAsia" w:hAnsi="Times New Roman"/>
-                <w:bCs/>
-                <w:sz w:val="22"/>
-                <w:szCs w:val="22"/>
-                <w:lang w:eastAsia="zh-CN"/>
-              </w:rPr>
-              <w:t xml:space="preserve"> see table 1.</w:t>
-            </w:r>
-          </w:p>
-          <w:p>
-            <w:pPr>
-              <w:outlineLvl w:val="0"/>
-              <w:rPr>
-                <w:rFonts w:ascii="Times New Roman" w:hAnsi="Times New Roman"/>
-                <w:bCs/>
-                <w:sz w:val="22"/>
-                <w:szCs w:val="22"/>
-              </w:rPr>
-            </w:pPr>
-          </w:p>
-          <w:p>
-            <w:pPr>
-              <w:outlineLvl w:val="0"/>
-              <w:rPr>
-                <w:rFonts w:ascii="Times New Roman" w:hAnsi="Times New Roman"/>
-                <w:bCs/>
-                <w:sz w:val="22"/>
-                <w:szCs w:val="22"/>
-              </w:rPr>
-            </w:pPr>
-            <w:r>
-              <w:rPr>
-                <w:rFonts w:ascii="Times New Roman" w:hAnsi="Times New Roman"/>
-                <w:bCs/>
-                <w:sz w:val="22"/>
-                <w:szCs w:val="22"/>
-              </w:rPr>
-              <w:t xml:space="preserve">Table </w:t>
-            </w:r>
-            <w:r>
-              <w:rPr>
-                <w:rFonts w:ascii="Times New Roman" w:eastAsiaTheme="minorEastAsia" w:hAnsi="Times New Roman" w:hint="eastAsia"/>
-                <w:bCs/>
-                <w:sz w:val="22"/>
-                <w:szCs w:val="22"/>
-                <w:lang w:eastAsia="zh-CN"/>
-              </w:rPr>
-              <w:t>2</w:t>
-            </w:r>
-            <w:r>
-              <w:rPr>
-                <w:rFonts w:ascii="Times New Roman" w:hAnsi="Times New Roman"/>
-                <w:bCs/>
-                <w:sz w:val="22"/>
-                <w:szCs w:val="22"/>
-              </w:rPr>
-              <w:t xml:space="preserve"> (see attached table) presents the environmental monitoring results for </w:t>
-            </w:r>
-            <w:r>
-              <w:rPr>
-                <w:rFonts w:ascii="Times New Roman" w:hAnsi="Times New Roman"/>
-                <w:bCs/>
-                <w:sz w:val="22"/>
-                <w:szCs w:val="22"/>
-              </w:rPr>
-              <w:t>{{ sample_id }}</w:t>
-            </w:r>
-            <w:r>
-              <w:rPr>
-                <w:rFonts w:ascii="Times New Roman" w:hAnsi="Times New Roman"/>
-                <w:bCs/>
-                <w:sz w:val="22"/>
-                <w:szCs w:val="22"/>
-              </w:rPr>
-              <w:t>. The environmental monitoring (EM) plates were incubated for no less than 48 hours at 30-35°C and no less than an additional five days at 20-25°C as per SOP 2.600.002 (Environmental Monitoring of the Clean-room Facility).</w:t>
-            </w:r>
-          </w:p>
-          <w:p>
-            <w:pPr>
-              <w:outlineLvl w:val="0"/>
-              <w:rPr>
-                <w:rFonts w:ascii="Times New Roman" w:hAnsi="Times New Roman"/>
-                <w:bCs/>
-                <w:sz w:val="22"/>
-                <w:szCs w:val="22"/>
-              </w:rPr>
-            </w:pPr>
-          </w:p>
-          <w:p>
-            <w:pPr>
-              <w:outlineLvl w:val="0"/>
-              <w:rPr>
-                <w:rFonts w:ascii="Times New Roman" w:hAnsi="Times New Roman"/>
-                <w:bCs/>
-                <w:sz w:val="22"/>
-                <w:szCs w:val="22"/>
-              </w:rPr>
-            </w:pPr>
-            <w:r>
-              <w:rPr>
-                <w:rFonts w:ascii="Times New Roman" w:hAnsi="Times New Roman"/>
-                <w:bCs/>
-                <w:sz w:val="22"/>
-                <w:szCs w:val="22"/>
-              </w:rPr>
+              <w:br/>
+              <w:br/>
+              <w:t>The analyst, {{ reader_name }}, confirmed that the equipment was set up as per ENG-SOP-4 (Scan RDI® System – Operations (Standard C3 Quality Check and Microscope Setup) and Maintenance), and the negative control and the positive control for the analyst, {{ reader_name }}, yielded expected results.</w:t>
+              <w:br/>
+              <w:br/>
+              <w:t>On {{ test_date }}, a rapid sterility test was conducted on the sample using the ScanRDI method. The sample was initially prepared by Analyst {{ prepper_name }}, processed by {{ analyst_name }}, and subsequently read by {{ analyst_name }}. The test revealed {{ confirm_number }} {{ organism_morphology }}-shaped viable microorganisms, see table 1.</w:t>
+              <w:br/>
+              <w:br/>
+              <w:t>Table 2 (see attached table) presents the environmental monitoring results for {{ sample_id }}. The environmental monitoring (EM) plates were incubated for no less than 48 hours at 30-35°C and no less than an additional five days at 20-25°C as per SOP 2.600.002 (Environmental Monitoring of the Clean-room Facility).</w:t>
+              <w:br/>
+              <w:br/>
               <w:t>{{ narrative_summary }}</w:t>
-            </w:r>
-          </w:p>
-          <w:p>
-            <w:pPr>
-              <w:outlineLvl w:val="0"/>
-              <w:rPr>
-                <w:rFonts w:ascii="Times New Roman" w:hAnsi="Times New Roman"/>
-                <w:bCs/>
-                <w:sz w:val="22"/>
-                <w:szCs w:val="22"/>
-              </w:rPr>
-            </w:pPr>
-          </w:p>
-          <w:p>
-            <w:pPr>
-              <w:outlineLvl w:val="0"/>
-              <w:rPr>
-                <w:rFonts w:ascii="Times New Roman" w:hAnsi="Times New Roman"/>
-                <w:bCs/>
-                <w:sz w:val="22"/>
-                <w:szCs w:val="22"/>
-              </w:rPr>
-            </w:pPr>
-            <w:r>
-              <w:rPr>
-                <w:rFonts w:ascii="Times New Roman" w:hAnsi="Times New Roman"/>
-                <w:bCs/>
-                <w:sz w:val="22"/>
-                <w:szCs w:val="22"/>
-              </w:rPr>
+              <w:br/>
+              <w:br/>
               <w:t xml:space="preserve">Monthly cleaning and disinfection, using H₂O₂, of the cleanroom (ISO 7) and its containing Biosafety Cabinets (BSCs, ISO 5) were performed on {{ monthly_cleaning_date }}, as per SOP 2.600.018 Cleaning and Disinfection Procedure. It was documented that all H₂O₂ indicators passed. </w:t>
-            </w:r>
-          </w:p>
-          <w:p>
-            <w:pPr>
-              <w:outlineLvl w:val="0"/>
-              <w:rPr>
-                <w:rFonts w:ascii="Times New Roman" w:hAnsi="Times New Roman"/>
-                <w:bCs/>
-                <w:sz w:val="22"/>
-                <w:szCs w:val="22"/>
-              </w:rPr>
-            </w:pPr>
-          </w:p>
-          <w:p>
-            <w:pPr>
-              <w:outlineLvl w:val="0"/>
-              <w:rPr>
-                <w:rFonts w:ascii="Times New Roman" w:hAnsi="Times New Roman"/>
-                <w:bCs/>
-                <w:sz w:val="22"/>
-                <w:szCs w:val="22"/>
-              </w:rPr>
-            </w:pPr>
-            <w:r>
-              <w:rPr>
-                <w:rFonts w:ascii="Times New Roman" w:hAnsi="Times New Roman"/>
-                <w:bCs/>
-                <w:sz w:val="22"/>
-                <w:szCs w:val="22"/>
-              </w:rPr>
+              <w:br/>
+              <w:br/>
               <w:t>{{ sample_history_paragraph }}</w:t>
-            </w:r>
-          </w:p>
-          <w:p>
-            <w:pPr>
-              <w:outlineLvl w:val="0"/>
-              <w:rPr>
-                <w:rFonts w:ascii="Times New Roman" w:hAnsi="Times New Roman"/>
-                <w:bCs/>
-                <w:sz w:val="22"/>
-                <w:szCs w:val="22"/>
-              </w:rPr>
-            </w:pPr>
-          </w:p>
-          <w:p>
-            <w:pPr>
-              <w:outlineLvl w:val="0"/>
-              <w:rPr>
-                <w:rFonts w:ascii="Times New Roman" w:hAnsi="Times New Roman"/>
-                <w:bCs/>
-                <w:sz w:val="22"/>
-                <w:szCs w:val="22"/>
-              </w:rPr>
-            </w:pPr>
-            <w:r>
-              <w:rPr>
-                <w:rFonts w:ascii="Times New Roman" w:hAnsi="Times New Roman"/>
-                <w:bCs/>
-                <w:sz w:val="22"/>
-                <w:szCs w:val="22"/>
-              </w:rPr>
-              <w:t xml:space="preserve">To assess the potential for sample-to-sample contamination contributing to the positive results, a comprehensive review was conducted of all samples processed on the same day. </w:t>
-            </w:r>
-            <w:r>
-              <w:rPr>
-                <w:rFonts w:ascii="Times New Roman" w:hAnsi="Times New Roman"/>
-                <w:bCs/>
-                <w:sz w:val="22"/>
-                <w:szCs w:val="22"/>
-              </w:rPr>
-              <w:t>{{ cross_contamination_summary }}</w:t>
-            </w:r>
-          </w:p>
-          <w:p>
-            <w:pPr>
-              <w:outlineLvl w:val="0"/>
-              <w:rPr>
-                <w:rFonts w:ascii="Times New Roman" w:hAnsi="Times New Roman"/>
-                <w:bCs/>
-                <w:sz w:val="22"/>
-                <w:szCs w:val="22"/>
-              </w:rPr>
-            </w:pPr>
-          </w:p>
-          <w:p>
-            <w:pPr>
-              <w:outlineLvl w:val="0"/>
-              <w:rPr>
-                <w:rFonts w:ascii="Times New Roman" w:eastAsiaTheme="minorEastAsia" w:hAnsi="Times New Roman"/>
-                <w:bCs/>
-                <w:sz w:val="22"/>
-                <w:szCs w:val="22"/>
-                <w:lang w:eastAsia="zh-CN"/>
-              </w:rPr>
-            </w:pPr>
-            <w:r>
-              <w:rPr>
-                <w:rFonts w:ascii="Times New Roman" w:eastAsiaTheme="minorEastAsia" w:hAnsi="Times New Roman" w:hint="eastAsia"/>
-                <w:bCs/>
-                <w:sz w:val="22"/>
-                <w:szCs w:val="22"/>
-                <w:lang w:eastAsia="zh-CN"/>
-              </w:rPr>
-              <w:t>B</w:t>
-            </w:r>
-            <w:r>
-              <w:rPr>
-                <w:rFonts w:ascii="Times New Roman" w:hAnsi="Times New Roman"/>
-                <w:bCs/>
-                <w:sz w:val="22"/>
-                <w:szCs w:val="22"/>
-              </w:rPr>
-              <w:t>ased on the observations outlined above, it is unlikely that the failing results were due to reagents, supplies, the cleanroom environment, the process, or analyst involvement. Consequently, the possibility of laboratory error contributing to this failure is minimal and the original result is deemed to be valid.</w:t>
-            </w:r>
-          </w:p>
-          <w:p>
-            <w:pPr>
-              <w:outlineLvl w:val="0"/>
-              <w:rPr>
-                <w:rFonts w:ascii="Times New Roman" w:eastAsiaTheme="minorEastAsia" w:hAnsi="Times New Roman"/>
-                <w:bCs/>
-                <w:sz w:val="22"/>
-                <w:szCs w:val="22"/>
-                <w:lang w:eastAsia="zh-CN"/>
-              </w:rPr>
-            </w:pPr>
+              <w:br/>
+              <w:br/>
+              <w:t>To assess the potential for sample-to-sample contamination contributing to the positive results, a comprehensive review was conducted of all samples processed on the same day. {{ cross_contamination_summary }}</w:t>
+              <w:br/>
+              <w:br/>
+              <w:t>Based on the observations outlined above, it is unlikely that the failing results were due to reagents, supplies, the cleanroom environment, the process, or analyst involvement. Consequently, the possibility of laboratory error contributing to this failure is minimal and the original result is deemed to be valid.</w:t>
+              <w:br/>
+            </w:r>
           </w:p>
         </w:tc>
       </w:tr>

</xml_diff>

<commit_message>
fix(scanrdi): deduplicate Table 2 single-BSC rows and dynamically map EM plate desiccation notes
</commit_message>
<xml_diff>
--- a/ScanRDI OOS P1 template 0.docx
+++ b/ScanRDI OOS P1 template 0.docx
@@ -12558,11 +12558,9 @@
             <w:r>
               <w:rPr>
                 <w:rFonts w:ascii="Times New Roman" w:hAnsi="Times New Roman"/>
-                <w:color w:val="000000" w:themeColor="text1"/>
-                <w:sz w:val="14"/>
-                <w:szCs w:val="14"/>
-              </w:rPr>
-              <w:t>None</w:t>
+                <w:sz w:val="14"/>
+              </w:rPr>
+              <w:t>{{ note_pers }}</w:t>
             </w:r>
           </w:p>
         </w:tc>
@@ -12600,78 +12598,9 @@
               <w:rPr>
                 <w:rFonts w:ascii="Times New Roman" w:hAnsi="Times New Roman"/>
                 <w:b/>
-                <w:bCs/>
-                <w:color w:val="000000" w:themeColor="text1"/>
-                <w:sz w:val="14"/>
-                <w:szCs w:val="14"/>
-              </w:rPr>
-              <w:t xml:space="preserve">Biological Safety Cabinet EM Bracketing Biological Safety Cabinet (BSC) </w:t>
-            </w:r>
-            <w:r>
-              <w:rPr>
-                <w:rFonts w:ascii="Times New Roman" w:hAnsi="Times New Roman"/>
-                <w:b/>
-                <w:bCs/>
-                <w:color w:val="000000" w:themeColor="text1"/>
-                <w:sz w:val="14"/>
-                <w:szCs w:val="14"/>
-              </w:rPr>
-              <w:t>E00</w:t>
-            </w:r>
-            <w:r>
-              <w:rPr>
-                <w:rFonts w:ascii="Times New Roman" w:hAnsi="Times New Roman"/>
-                <w:b/>
-                <w:bCs/>
-                <w:color w:val="000000" w:themeColor="text1"/>
-                <w:sz w:val="14"/>
-                <w:szCs w:val="14"/>
-              </w:rPr>
-              <w:t>{{ bsc_id }}</w:t>
-            </w:r>
-            <w:r>
-              <w:rPr>
-                <w:rFonts w:ascii="Times New Roman" w:hAnsi="Times New Roman"/>
-                <w:b/>
-                <w:bCs/>
-                <w:color w:val="000000" w:themeColor="text1"/>
-                <w:sz w:val="14"/>
-                <w:szCs w:val="14"/>
-              </w:rPr>
-              <w:t xml:space="preserve"> and E00</w:t>
-            </w:r>
-            <w:r>
-              <w:rPr>
-                <w:rFonts w:ascii="Times New Roman" w:hAnsi="Times New Roman"/>
-                <w:b/>
-                <w:bCs/>
-                <w:color w:val="000000" w:themeColor="text1"/>
-                <w:sz w:val="14"/>
-                <w:szCs w:val="14"/>
-              </w:rPr>
-              <w:t xml:space="preserve">{{ </w:t>
-            </w:r>
-            <w:r>
-              <w:rPr>
-                <w:rFonts w:ascii="Times New Roman" w:hAnsi="Times New Roman"/>
-                <w:b/>
-                <w:bCs/>
-                <w:color w:val="000000" w:themeColor="text1"/>
-                <w:sz w:val="14"/>
-                <w:szCs w:val="14"/>
-              </w:rPr>
-              <w:t>chgbsc_id</w:t>
-            </w:r>
-            <w:r>
-              <w:rPr>
-                <w:rFonts w:ascii="Times New Roman" w:hAnsi="Times New Roman"/>
-                <w:b/>
-                <w:bCs/>
-                <w:color w:val="000000" w:themeColor="text1"/>
-                <w:sz w:val="14"/>
-                <w:szCs w:val="14"/>
-              </w:rPr>
-              <w:t xml:space="preserve"> }}</w:t>
+                <w:sz w:val="14"/>
+              </w:rPr>
+              <w:t>{{ smart_bsc_bracketing_header }}</w:t>
             </w:r>
           </w:p>
         </w:tc>
@@ -13054,12 +12983,10 @@
             </w:pPr>
             <w:r>
               <w:rPr>
-                <w:rFonts w:ascii="Times New Roman" w:eastAsiaTheme="minorEastAsia" w:hAnsi="Times New Roman" w:cstheme="minorBidi"/>
-                <w:color w:val="000000" w:themeColor="text1"/>
-                <w:sz w:val="14"/>
-                <w:szCs w:val="14"/>
-              </w:rPr>
-              <w:t>None</w:t>
+                <w:rFonts w:ascii="Times New Roman" w:hAnsi="Times New Roman"/>
+                <w:sz w:val="14"/>
+              </w:rPr>
+              <w:t>{{ note_surf }}</w:t>
             </w:r>
           </w:p>
         </w:tc>
@@ -13475,12 +13402,10 @@
             </w:pPr>
             <w:r>
               <w:rPr>
-                <w:rFonts w:ascii="Times New Roman" w:eastAsiaTheme="minorEastAsia" w:hAnsi="Times New Roman" w:cstheme="minorBidi"/>
-                <w:color w:val="000000" w:themeColor="text1"/>
-                <w:sz w:val="14"/>
-                <w:szCs w:val="14"/>
-              </w:rPr>
-              <w:t>None</w:t>
+                <w:rFonts w:ascii="Times New Roman" w:hAnsi="Times New Roman"/>
+                <w:sz w:val="14"/>
+              </w:rPr>
+              <w:t>{{ note_surf_chg }}</w:t>
             </w:r>
           </w:p>
         </w:tc>
@@ -13836,12 +13761,10 @@
             </w:pPr>
             <w:r>
               <w:rPr>
-                <w:rFonts w:ascii="Times New Roman" w:eastAsiaTheme="minorEastAsia" w:hAnsi="Times New Roman" w:cstheme="minorBidi"/>
-                <w:color w:val="000000" w:themeColor="text1"/>
-                <w:sz w:val="14"/>
-                <w:szCs w:val="14"/>
-              </w:rPr>
-              <w:t>None</w:t>
+                <w:rFonts w:ascii="Times New Roman" w:hAnsi="Times New Roman"/>
+                <w:sz w:val="14"/>
+              </w:rPr>
+              <w:t>{{ note_sett }}</w:t>
             </w:r>
           </w:p>
         </w:tc>
@@ -14231,12 +14154,10 @@
             </w:pPr>
             <w:r>
               <w:rPr>
-                <w:rFonts w:ascii="Times New Roman" w:eastAsiaTheme="minorEastAsia" w:hAnsi="Times New Roman" w:cstheme="minorBidi"/>
-                <w:color w:val="000000" w:themeColor="text1"/>
-                <w:sz w:val="14"/>
-                <w:szCs w:val="14"/>
-              </w:rPr>
-              <w:t>None</w:t>
+                <w:rFonts w:ascii="Times New Roman" w:hAnsi="Times New Roman"/>
+                <w:sz w:val="14"/>
+              </w:rPr>
+              <w:t>{{ note_sett_chg }}</w:t>
             </w:r>
           </w:p>
         </w:tc>
@@ -14820,11 +14741,9 @@
             <w:r>
               <w:rPr>
                 <w:rFonts w:ascii="Times New Roman" w:hAnsi="Times New Roman"/>
-                <w:color w:val="000000" w:themeColor="text1"/>
-                <w:sz w:val="14"/>
-                <w:szCs w:val="14"/>
-              </w:rPr>
-              <w:t>None</w:t>
+                <w:sz w:val="14"/>
+              </w:rPr>
+              <w:t>{{ note_air }}</w:t>
             </w:r>
           </w:p>
         </w:tc>
@@ -15159,11 +15078,9 @@
             <w:r>
               <w:rPr>
                 <w:rFonts w:ascii="Times New Roman" w:hAnsi="Times New Roman"/>
-                <w:color w:val="000000" w:themeColor="text1"/>
-                <w:sz w:val="14"/>
-                <w:szCs w:val="14"/>
-              </w:rPr>
-              <w:t>None</w:t>
+                <w:sz w:val="14"/>
+              </w:rPr>
+              <w:t>{{ note_room }}</w:t>
             </w:r>
           </w:p>
         </w:tc>

</xml_diff>

<commit_message>
feat(scanrdi): conditionally remove Trend Table when prior <= 3, widen Notes column by 2.6x, and remove date from BSC bracketing header
</commit_message>
<xml_diff>
--- a/ScanRDI OOS P1 template 0.docx
+++ b/ScanRDI OOS P1 template 0.docx
@@ -11822,17 +11822,17 @@
         <w:gridCol w:w="1223"/>
         <w:gridCol w:w="27"/>
         <w:gridCol w:w="810"/>
-        <w:gridCol w:w="900"/>
         <w:gridCol w:w="709"/>
+        <w:gridCol w:w="630"/>
         <w:gridCol w:w="11"/>
-        <w:gridCol w:w="720"/>
-        <w:gridCol w:w="810"/>
-        <w:gridCol w:w="1260"/>
+        <w:gridCol w:w="504"/>
+        <w:gridCol w:w="551"/>
+        <w:gridCol w:w="1181"/>
         <w:gridCol w:w="90"/>
-        <w:gridCol w:w="1260"/>
+        <w:gridCol w:w="1181"/>
         <w:gridCol w:w="90"/>
-        <w:gridCol w:w="1260"/>
-        <w:gridCol w:w="615"/>
+        <w:gridCol w:w="1181"/>
+        <w:gridCol w:w="1597"/>
       </w:tblGrid>
       <w:tr>
         <w:trPr>

</xml_diff>